<commit_message>
Update test cases and bug report
</commit_message>
<xml_diff>
--- a/TestCasesAndBugReport.docx
+++ b/TestCasesAndBugReport.docx
@@ -139,68 +139,12 @@
         <w:t xml:space="preserve"> </w:t>
       </w:r>
       <w:r>
-        <w:t>name</w:t>
-      </w:r>
-      <w:r>
-        <w:t xml:space="preserve">, </w:t>
-      </w:r>
-      <w:r>
-        <w:t>image</w:t>
-      </w:r>
-      <w:r>
-        <w:t xml:space="preserve">, </w:t>
-      </w:r>
-      <w:r>
-        <w:t>price</w:t>
-      </w:r>
-      <w:r>
-        <w:t xml:space="preserve">, </w:t>
-      </w:r>
-      <w:r>
-        <w:t>discount percentage</w:t>
-      </w:r>
-      <w:r>
-        <w:t xml:space="preserve">, </w:t>
-      </w:r>
-      <w:r>
-        <w:t>was price</w:t>
-      </w:r>
-      <w:r>
-        <w:t xml:space="preserve">, </w:t>
-      </w:r>
-      <w:r>
-        <w:t>weight</w:t>
-      </w:r>
-      <w:r>
-        <w:t xml:space="preserve"> and ‘M</w:t>
-      </w:r>
-      <w:r>
-        <w:t>any in stock</w:t>
-      </w:r>
-      <w:r>
-        <w:t>’</w:t>
-      </w:r>
-      <w:r>
-        <w:t xml:space="preserve"> label</w:t>
-      </w:r>
-    </w:p>
-    <w:p>
-      <w:r>
-        <w:t xml:space="preserve">Shopping list: </w:t>
-      </w:r>
-      <w:r>
-        <w:t xml:space="preserve">have and existing shopping list named </w:t>
-      </w:r>
-      <w:proofErr w:type="spellStart"/>
-      <w:r>
-        <w:t>eg.</w:t>
-      </w:r>
-      <w:proofErr w:type="spellEnd"/>
-      <w:r>
-        <w:t xml:space="preserve">: </w:t>
-      </w:r>
-      <w:r>
-        <w:t>Weekly Groceries.</w:t>
+        <w:t>name, image, price, discount percentage, was price, weight and ‘Many in stock’ label</w:t>
+      </w:r>
+    </w:p>
+    <w:p>
+      <w:r>
+        <w:t>Shopping list: have and existing shopping list named eg.: Weekly Groceries.</w:t>
       </w:r>
     </w:p>
     <w:p/>
@@ -264,13 +208,7 @@
         </w:numPr>
       </w:pPr>
       <w:r>
-        <w:t>C</w:t>
-      </w:r>
-      <w:r>
-        <w:t xml:space="preserve">lick on “Add to saved list” </w:t>
-      </w:r>
-      <w:r>
-        <w:t xml:space="preserve">– thick the checkbox of your existing shopping list and click </w:t>
+        <w:t xml:space="preserve">Click on “Add to saved list” – thick the checkbox of your existing shopping list and click </w:t>
       </w:r>
       <w:r>
         <w:t>on “Save to list” button.</w:t>
@@ -291,13 +229,8 @@
         <w:t xml:space="preserve"> by clicking on the “View list” button on the </w:t>
       </w:r>
       <w:r>
-        <w:t xml:space="preserve">notification/confirmation </w:t>
-      </w:r>
-      <w:proofErr w:type="spellStart"/>
-      <w:r>
-        <w:t>snackbar</w:t>
-      </w:r>
-      <w:proofErr w:type="spellEnd"/>
+        <w:t>notification/confirmation snackbar</w:t>
+      </w:r>
       <w:r>
         <w:t xml:space="preserve"> appearing in the bottom left corner of the page</w:t>
       </w:r>
@@ -392,11 +325,7 @@
         <w:t>you</w:t>
       </w:r>
       <w:r>
-        <w:t xml:space="preserve"> redirected to the “Your saved </w:t>
-      </w:r>
-      <w:proofErr w:type="gramStart"/>
-      <w:r>
-        <w:t>list</w:t>
+        <w:t xml:space="preserve"> redirected to the “Your saved list</w:t>
       </w:r>
       <w:r>
         <w:t xml:space="preserve">“ </w:t>
@@ -404,7 +333,6 @@
       <w:r>
         <w:t>view</w:t>
       </w:r>
-      <w:proofErr w:type="gramEnd"/>
       <w:r>
         <w:t xml:space="preserve"> </w:t>
       </w:r>
@@ -448,16 +376,11 @@
         <w:t>After step 4, a</w:t>
       </w:r>
       <w:r>
-        <w:t xml:space="preserve"> success confirmation is shown (toast/</w:t>
-      </w:r>
-      <w:proofErr w:type="spellStart"/>
-      <w:r>
-        <w:t>snackba</w:t>
+        <w:t xml:space="preserve"> success confirmation is shown (toast/snackba</w:t>
       </w:r>
       <w:r>
         <w:t>r</w:t>
       </w:r>
-      <w:proofErr w:type="spellEnd"/>
       <w:r>
         <w:t>) after adding.</w:t>
       </w:r>
@@ -475,10 +398,7 @@
         </w:numPr>
       </w:pPr>
       <w:r>
-        <w:t xml:space="preserve">The selected product appears </w:t>
-      </w:r>
-      <w:r>
-        <w:t xml:space="preserve">on </w:t>
+        <w:t xml:space="preserve">The selected product appears on </w:t>
       </w:r>
       <w:r>
         <w:rPr>
@@ -488,10 +408,7 @@
         <w:t>“Your saved lists view”</w:t>
       </w:r>
       <w:r>
-        <w:t xml:space="preserve"> </w:t>
-      </w:r>
-      <w:r>
-        <w:t>with correct name/image /price/discount percentage/was price/weight/many in stock label, as displayed on the product card. It appears after page refresh too.</w:t>
+        <w:t xml:space="preserve"> with correct name/image /price/discount percentage/was price/weight/many in stock label, as displayed on the product card. It appears after page refresh too.</w:t>
       </w:r>
     </w:p>
     <w:p/>
@@ -553,16 +470,7 @@
         <w:t xml:space="preserve">The product on both </w:t>
       </w:r>
       <w:r>
-        <w:t>“Your saved lists view”</w:t>
-      </w:r>
-      <w:r>
-        <w:t xml:space="preserve"> and </w:t>
-      </w:r>
-      <w:r>
-        <w:t>Weekly Groceries shopping list</w:t>
-      </w:r>
-      <w:r>
-        <w:t>, has a</w:t>
+        <w:t>“Your saved lists view” and Weekly Groceries shopping list, has a</w:t>
       </w:r>
       <w:r>
         <w:t xml:space="preserve"> +Add button on it</w:t>
@@ -591,13 +499,7 @@
         <w:t>“</w:t>
       </w:r>
       <w:r>
-        <w:t>Your saved lists view”</w:t>
-      </w:r>
-      <w:r>
-        <w:t xml:space="preserve">, nor on </w:t>
-      </w:r>
-      <w:r>
-        <w:t>Weekly Groceries shopping list</w:t>
+        <w:t>Your saved lists view”, nor on Weekly Groceries shopping list</w:t>
       </w:r>
       <w:r>
         <w:t>.</w:t>
@@ -632,15 +534,7 @@
         <w:t xml:space="preserve">When revisiting the “Your saved lists” view through the account dropdown – </w:t>
       </w:r>
       <w:r>
-        <w:t xml:space="preserve">the text on the link leads to the Weekly Groceries shopping list is “Show </w:t>
-      </w:r>
-      <w:proofErr w:type="gramStart"/>
-      <w:r>
-        <w:t>item”(</w:t>
-      </w:r>
-      <w:proofErr w:type="gramEnd"/>
-      <w:r>
-        <w:t>as there is only a single item on the list)</w:t>
+        <w:t>the text on the link leads to the Weekly Groceries shopping list is “Show item”(as there is only a single item on the list)</w:t>
       </w:r>
     </w:p>
     <w:p/>
@@ -806,10 +700,7 @@
         </w:numPr>
       </w:pPr>
       <w:r>
-        <w:t>O</w:t>
-      </w:r>
-      <w:r>
-        <w:t>pen a product detail page.</w:t>
+        <w:t>Open a product detail page.</w:t>
       </w:r>
     </w:p>
     <w:p>
@@ -1015,13 +906,7 @@
     </w:p>
     <w:p>
       <w:r>
-        <w:t xml:space="preserve">Shopping list Weekly Groceries2 exists and is </w:t>
-      </w:r>
-      <w:r>
-        <w:t>empty</w:t>
-      </w:r>
-      <w:r>
-        <w:t>.</w:t>
+        <w:t>Shopping list Weekly Groceries2 exists and is empty.</w:t>
       </w:r>
     </w:p>
     <w:p/>
@@ -1060,16 +945,7 @@
     </w:p>
     <w:p>
       <w:r>
-        <w:t>Product3 (</w:t>
-      </w:r>
-      <w:r>
-        <w:t xml:space="preserve">in cart, quantity </w:t>
-      </w:r>
-      <w:r>
-        <w:t>2</w:t>
-      </w:r>
-      <w:r>
-        <w:t>)</w:t>
+        <w:t>Product3 (in cart, quantity 2)</w:t>
       </w:r>
     </w:p>
     <w:p/>
@@ -1112,13 +988,7 @@
         <w:t>to Weekly Groceries</w:t>
       </w:r>
       <w:r>
-        <w:t xml:space="preserve">1 and to </w:t>
-      </w:r>
-      <w:r>
-        <w:t>Weekly Groceries2</w:t>
-      </w:r>
-      <w:r>
-        <w:t xml:space="preserve"> simultaneously (one click)</w:t>
+        <w:t>1 and to Weekly Groceries2 simultaneously (one click)</w:t>
       </w:r>
     </w:p>
     <w:p/>
@@ -1140,10 +1010,7 @@
         <w:t xml:space="preserve"> to Weekly Groceries</w:t>
       </w:r>
       <w:r>
-        <w:t xml:space="preserve"> </w:t>
-      </w:r>
-      <w:r>
-        <w:t>Groceries1 and to Weekly Groceries2 simultaneously (one click)</w:t>
+        <w:t xml:space="preserve"> Groceries1 and to Weekly Groceries2 simultaneously (one click)</w:t>
       </w:r>
     </w:p>
     <w:p/>
@@ -1214,13 +1081,7 @@
         </w:numPr>
       </w:pPr>
       <w:r>
-        <w:t>Remove Product1 from “</w:t>
-      </w:r>
-      <w:r>
-        <w:t>Groceries Groceries1</w:t>
-      </w:r>
-      <w:r>
-        <w:t>” shopping list</w:t>
+        <w:t>Remove Product1 from “Groceries Groceries1” shopping list</w:t>
       </w:r>
     </w:p>
     <w:p>
@@ -1283,19 +1144,7 @@
         </w:numPr>
       </w:pPr>
       <w:r>
-        <w:t>After step 1, 2 and 3, both “</w:t>
-      </w:r>
-      <w:r>
-        <w:t>Weekly Groceries1</w:t>
-      </w:r>
-      <w:r>
-        <w:t>” and “</w:t>
-      </w:r>
-      <w:r>
-        <w:t>Weekly Groceries</w:t>
-      </w:r>
-      <w:r>
-        <w:t>2” shopping list contains the Products we attempted to add to them. After each step, the appropriate products appear on both lists.</w:t>
+        <w:t>After step 1, 2 and 3, both “Weekly Groceries1” and “Weekly Groceries2” shopping list contains the Products we attempted to add to them. After each step, the appropriate products appear on both lists.</w:t>
       </w:r>
       <w:r>
         <w:t xml:space="preserve"> All products appear only once on both shopping list. </w:t>
@@ -1352,22 +1201,7 @@
         </w:numPr>
       </w:pPr>
       <w:r>
-        <w:t xml:space="preserve">After step 6, Product1 is removed from </w:t>
-      </w:r>
-      <w:r>
-        <w:t>“Groceries Groceries1”</w:t>
-      </w:r>
-      <w:r>
-        <w:t xml:space="preserve"> but not removed from </w:t>
-      </w:r>
-      <w:r>
-        <w:t>“Groceries Groceries</w:t>
-      </w:r>
-      <w:r>
-        <w:t>2</w:t>
-      </w:r>
-      <w:r>
-        <w:t>”</w:t>
+        <w:t>After step 6, Product1 is removed from “Groceries Groceries1” but not removed from “Groceries Groceries2”</w:t>
       </w:r>
     </w:p>
     <w:p>
@@ -1397,10 +1231,7 @@
         </w:numPr>
       </w:pPr>
       <w:r>
-        <w:t>After page reload</w:t>
-      </w:r>
-      <w:r>
-        <w:t xml:space="preserve"> the final state persists.</w:t>
+        <w:t>After page reload the final state persists.</w:t>
       </w:r>
     </w:p>
     <w:p>
@@ -1714,13 +1545,7 @@
         </w:numPr>
       </w:pPr>
       <w:r>
-        <w:t>C</w:t>
-      </w:r>
-      <w:r>
-        <w:t>lick on “Add to saved list”</w:t>
-      </w:r>
-      <w:r>
-        <w:t xml:space="preserve"> again and choose the same shopping list to add to. (Attempt to add the same product to the same shopping list again.)</w:t>
+        <w:t>Click on “Add to saved list” again and choose the same shopping list to add to. (Attempt to add the same product to the same shopping list again.)</w:t>
       </w:r>
     </w:p>
     <w:p>
@@ -1796,6 +1621,9 @@
     </w:p>
     <w:p>
       <w:r>
+        <w:rPr>
+          <w:noProof/>
+        </w:rPr>
         <w:drawing>
           <wp:inline distT="0" distB="0" distL="0" distR="0" wp14:anchorId="3F773E72" wp14:editId="6B95CE8B">
             <wp:extent cx="5943600" cy="6352540"/>
@@ -1853,6 +1681,9 @@
     </w:p>
     <w:p>
       <w:r>
+        <w:rPr>
+          <w:noProof/>
+        </w:rPr>
         <w:drawing>
           <wp:inline distT="0" distB="0" distL="0" distR="0" wp14:anchorId="17D8145C" wp14:editId="023450BC">
             <wp:extent cx="5943600" cy="2845435"/>
@@ -1892,6 +1723,9 @@
     </w:p>
     <w:p>
       <w:r>
+        <w:rPr>
+          <w:noProof/>
+        </w:rPr>
         <w:drawing>
           <wp:inline distT="0" distB="0" distL="0" distR="0" wp14:anchorId="3D67BDF4" wp14:editId="4FEF0D09">
             <wp:extent cx="5372100" cy="4622800"/>
@@ -2009,10 +1843,7 @@
         <w:t xml:space="preserve"> I found the bug during the by weekly regular manual regression test execution on </w:t>
       </w:r>
       <w:r>
-        <w:t>2026-09-30</w:t>
-      </w:r>
-      <w:r>
-        <w:t xml:space="preserve">. The bug was not present two weeks earlier </w:t>
+        <w:t xml:space="preserve">2026-09-30. The bug was not present two weeks earlier </w:t>
       </w:r>
       <w:r>
         <w:t xml:space="preserve">at the end of the previous sprint. </w:t>
@@ -2069,6 +1900,1858 @@
       </w:r>
     </w:p>
     <w:p/>
+    <w:p/>
+    <w:p/>
+    <w:p/>
+    <w:p/>
+    <w:p>
+      <w:pPr>
+        <w:rPr>
+          <w:b/>
+          <w:bCs/>
+          <w:sz w:val="32"/>
+          <w:szCs w:val="32"/>
+        </w:rPr>
+      </w:pPr>
+      <w:r>
+        <w:rPr>
+          <w:b/>
+          <w:bCs/>
+          <w:sz w:val="32"/>
+          <w:szCs w:val="32"/>
+        </w:rPr>
+        <w:lastRenderedPageBreak/>
+        <w:t>Bonus Quest</w:t>
+      </w:r>
+      <w:r>
+        <w:rPr>
+          <w:b/>
+          <w:bCs/>
+          <w:sz w:val="32"/>
+          <w:szCs w:val="32"/>
+        </w:rPr>
+        <w:t>ions</w:t>
+      </w:r>
+    </w:p>
+    <w:p>
+      <w:pPr>
+        <w:rPr>
+          <w:b/>
+          <w:bCs/>
+          <w:sz w:val="32"/>
+          <w:szCs w:val="32"/>
+        </w:rPr>
+      </w:pPr>
+      <w:r>
+        <w:rPr>
+          <w:b/>
+          <w:bCs/>
+          <w:sz w:val="32"/>
+          <w:szCs w:val="32"/>
+        </w:rPr>
+        <w:t>Docker:</w:t>
+      </w:r>
+    </w:p>
+    <w:p>
+      <w:pPr>
+        <w:rPr>
+          <w:b/>
+          <w:bCs/>
+          <w:sz w:val="32"/>
+          <w:szCs w:val="32"/>
+        </w:rPr>
+      </w:pPr>
+      <w:r>
+        <w:rPr>
+          <w:b/>
+          <w:bCs/>
+          <w:sz w:val="32"/>
+          <w:szCs w:val="32"/>
+        </w:rPr>
+        <w:t>Explain what Docker is and how it can be beneficial for a QA engineer. Provide a simple example of how you would set up an automated testing environment using Docker.</w:t>
+      </w:r>
+    </w:p>
+    <w:p>
+      <w:pPr>
+        <w:autoSpaceDE w:val="0"/>
+        <w:autoSpaceDN w:val="0"/>
+        <w:adjustRightInd w:val="0"/>
+        <w:spacing w:after="0" w:line="240" w:lineRule="auto"/>
+        <w:rPr>
+          <w:rFonts w:ascii="AppleSystemUIFont" w:hAnsi="AppleSystemUIFont" w:cs="AppleSystemUIFont"/>
+          <w:kern w:val="0"/>
+          <w:sz w:val="26"/>
+          <w:szCs w:val="26"/>
+        </w:rPr>
+      </w:pPr>
+      <w:r>
+        <w:rPr>
+          <w:rFonts w:ascii="AppleSystemUIFont" w:hAnsi="AppleSystemUIFont" w:cs="AppleSystemUIFont"/>
+          <w:kern w:val="0"/>
+          <w:sz w:val="26"/>
+          <w:szCs w:val="26"/>
+        </w:rPr>
+        <w:t>Docker bundles the software and tools a test needs into a package called an </w:t>
+      </w:r>
+      <w:r>
+        <w:rPr>
+          <w:rFonts w:ascii="AppleSystemUIFont" w:hAnsi="AppleSystemUIFont" w:cs="AppleSystemUIFont"/>
+          <w:b/>
+          <w:bCs/>
+          <w:kern w:val="0"/>
+          <w:sz w:val="26"/>
+          <w:szCs w:val="26"/>
+        </w:rPr>
+        <w:t>image</w:t>
+      </w:r>
+      <w:r>
+        <w:rPr>
+          <w:rFonts w:ascii="AppleSystemUIFont" w:hAnsi="AppleSystemUIFont" w:cs="AppleSystemUIFont"/>
+          <w:kern w:val="0"/>
+          <w:sz w:val="26"/>
+          <w:szCs w:val="26"/>
+        </w:rPr>
+        <w:t>. When you start that package, it runs as a </w:t>
+      </w:r>
+      <w:r>
+        <w:rPr>
+          <w:rFonts w:ascii="AppleSystemUIFont" w:hAnsi="AppleSystemUIFont" w:cs="AppleSystemUIFont"/>
+          <w:b/>
+          <w:bCs/>
+          <w:kern w:val="0"/>
+          <w:sz w:val="26"/>
+          <w:szCs w:val="26"/>
+        </w:rPr>
+        <w:t>container</w:t>
+      </w:r>
+      <w:r>
+        <w:rPr>
+          <w:rFonts w:ascii="AppleSystemUIFont" w:hAnsi="AppleSystemUIFont" w:cs="AppleSystemUIFont"/>
+          <w:kern w:val="0"/>
+          <w:sz w:val="26"/>
+          <w:szCs w:val="26"/>
+        </w:rPr>
+        <w:t>, an isolated process that uses the packaged environment.</w:t>
+      </w:r>
+    </w:p>
+    <w:p>
+      <w:pPr>
+        <w:autoSpaceDE w:val="0"/>
+        <w:autoSpaceDN w:val="0"/>
+        <w:adjustRightInd w:val="0"/>
+        <w:spacing w:after="0" w:line="240" w:lineRule="auto"/>
+        <w:rPr>
+          <w:rFonts w:ascii="AppleSystemUIFont" w:hAnsi="AppleSystemUIFont" w:cs="AppleSystemUIFont"/>
+          <w:kern w:val="0"/>
+          <w:sz w:val="26"/>
+          <w:szCs w:val="26"/>
+        </w:rPr>
+      </w:pPr>
+    </w:p>
+    <w:p>
+      <w:pPr>
+        <w:rPr>
+          <w:rFonts w:ascii="AppleSystemUIFont" w:hAnsi="AppleSystemUIFont" w:cs="AppleSystemUIFont"/>
+          <w:kern w:val="0"/>
+          <w:sz w:val="26"/>
+          <w:szCs w:val="26"/>
+        </w:rPr>
+      </w:pPr>
+      <w:r>
+        <w:rPr>
+          <w:rFonts w:ascii="AppleSystemUIFont" w:hAnsi="AppleSystemUIFont" w:cs="AppleSystemUIFont"/>
+          <w:kern w:val="0"/>
+          <w:sz w:val="26"/>
+          <w:szCs w:val="26"/>
+        </w:rPr>
+        <w:t>For QA, this helps tests run in a consistent setup on different computers and in CI</w:t>
+      </w:r>
+      <w:r>
+        <w:rPr>
+          <w:rFonts w:ascii="AppleSystemUIFont" w:hAnsi="AppleSystemUIFont" w:cs="AppleSystemUIFont"/>
+          <w:kern w:val="0"/>
+          <w:sz w:val="26"/>
+          <w:szCs w:val="26"/>
+        </w:rPr>
+        <w:t>. It is beneficial for a team of QAs working on the same project</w:t>
+      </w:r>
+      <w:r>
+        <w:rPr>
+          <w:rFonts w:ascii="AppleSystemUIFont" w:hAnsi="AppleSystemUIFont" w:cs="AppleSystemUIFont"/>
+          <w:kern w:val="0"/>
+          <w:sz w:val="26"/>
+          <w:szCs w:val="26"/>
+        </w:rPr>
+        <w:t xml:space="preserve">. It reduces problems caused by one </w:t>
+      </w:r>
+      <w:r>
+        <w:rPr>
+          <w:rFonts w:ascii="AppleSystemUIFont" w:hAnsi="AppleSystemUIFont" w:cs="AppleSystemUIFont"/>
+          <w:kern w:val="0"/>
+          <w:sz w:val="26"/>
+          <w:szCs w:val="26"/>
+        </w:rPr>
+        <w:t xml:space="preserve">or more </w:t>
+      </w:r>
+      <w:r>
+        <w:rPr>
+          <w:rFonts w:ascii="AppleSystemUIFont" w:hAnsi="AppleSystemUIFont" w:cs="AppleSystemUIFont"/>
+          <w:kern w:val="0"/>
+          <w:sz w:val="26"/>
+          <w:szCs w:val="26"/>
+        </w:rPr>
+        <w:t>machine</w:t>
+      </w:r>
+      <w:r>
+        <w:rPr>
+          <w:rFonts w:ascii="AppleSystemUIFont" w:hAnsi="AppleSystemUIFont" w:cs="AppleSystemUIFont"/>
+          <w:kern w:val="0"/>
+          <w:sz w:val="26"/>
+          <w:szCs w:val="26"/>
+        </w:rPr>
+        <w:t>s</w:t>
+      </w:r>
+      <w:r>
+        <w:rPr>
+          <w:rFonts w:ascii="AppleSystemUIFont" w:hAnsi="AppleSystemUIFont" w:cs="AppleSystemUIFont"/>
+          <w:kern w:val="0"/>
+          <w:sz w:val="26"/>
+          <w:szCs w:val="26"/>
+        </w:rPr>
+        <w:t xml:space="preserve"> having different software versions or missing dependencies. Unlike a virtual machine, Docker doesn’t need to run a whole separate operating system.</w:t>
+      </w:r>
+    </w:p>
+    <w:p>
+      <w:pPr>
+        <w:rPr>
+          <w:rFonts w:ascii="AppleSystemUIFont" w:hAnsi="AppleSystemUIFont" w:cs="AppleSystemUIFont"/>
+          <w:kern w:val="0"/>
+          <w:sz w:val="26"/>
+          <w:szCs w:val="26"/>
+        </w:rPr>
+      </w:pPr>
+    </w:p>
+    <w:p>
+      <w:pPr>
+        <w:rPr>
+          <w:rFonts w:ascii="AppleSystemUIFont" w:hAnsi="AppleSystemUIFont" w:cs="AppleSystemUIFont"/>
+          <w:kern w:val="0"/>
+          <w:sz w:val="26"/>
+          <w:szCs w:val="26"/>
+        </w:rPr>
+      </w:pPr>
+    </w:p>
+    <w:p>
+      <w:pPr>
+        <w:rPr>
+          <w:sz w:val="32"/>
+          <w:szCs w:val="32"/>
+        </w:rPr>
+      </w:pPr>
+      <w:r>
+        <w:rPr>
+          <w:sz w:val="32"/>
+          <w:szCs w:val="32"/>
+        </w:rPr>
+        <w:t>Example how would I set up</w:t>
+      </w:r>
+      <w:r>
+        <w:rPr>
+          <w:sz w:val="32"/>
+          <w:szCs w:val="32"/>
+        </w:rPr>
+        <w:t xml:space="preserve"> an automated testing environment using Docker</w:t>
+      </w:r>
+      <w:r>
+        <w:rPr>
+          <w:sz w:val="32"/>
+          <w:szCs w:val="32"/>
+        </w:rPr>
+        <w:t>:</w:t>
+      </w:r>
+    </w:p>
+    <w:p>
+      <w:pPr>
+        <w:autoSpaceDE w:val="0"/>
+        <w:autoSpaceDN w:val="0"/>
+        <w:adjustRightInd w:val="0"/>
+        <w:spacing w:after="0" w:line="240" w:lineRule="auto"/>
+        <w:rPr>
+          <w:rFonts w:ascii="AppleSystemUIFont" w:hAnsi="AppleSystemUIFont" w:cs="AppleSystemUIFont"/>
+          <w:kern w:val="0"/>
+          <w:sz w:val="26"/>
+          <w:szCs w:val="26"/>
+        </w:rPr>
+      </w:pPr>
+      <w:r>
+        <w:rPr>
+          <w:rFonts w:ascii="AppleSystemUIFont" w:hAnsi="AppleSystemUIFont" w:cs="AppleSystemUIFont"/>
+          <w:kern w:val="0"/>
+          <w:sz w:val="26"/>
+          <w:szCs w:val="26"/>
+        </w:rPr>
+        <w:t>For this Playwright project, I would use the official Playwright image, which includes the browser dependencies. The image version should match the @playwright/test version in package.json.</w:t>
+      </w:r>
+    </w:p>
+    <w:p>
+      <w:pPr>
+        <w:rPr>
+          <w:sz w:val="32"/>
+          <w:szCs w:val="32"/>
+        </w:rPr>
+      </w:pPr>
+    </w:p>
+    <w:p>
+      <w:pPr>
+        <w:rPr>
+          <w:b/>
+          <w:bCs/>
+          <w:sz w:val="28"/>
+          <w:szCs w:val="28"/>
+        </w:rPr>
+      </w:pPr>
+      <w:r>
+        <w:rPr>
+          <w:b/>
+          <w:bCs/>
+          <w:sz w:val="28"/>
+          <w:szCs w:val="28"/>
+        </w:rPr>
+        <w:t>The Dockerfile would contain these (Dockerfile is where described how to set up the package/image):</w:t>
+      </w:r>
+    </w:p>
+    <w:p>
+      <w:pPr>
+        <w:rPr>
+          <w:b/>
+          <w:bCs/>
+        </w:rPr>
+      </w:pPr>
+    </w:p>
+    <w:p>
+      <w:pPr>
+        <w:rPr>
+          <w:b/>
+          <w:bCs/>
+          <w:sz w:val="28"/>
+          <w:szCs w:val="28"/>
+        </w:rPr>
+      </w:pPr>
+      <w:r>
+        <w:rPr>
+          <w:b/>
+          <w:bCs/>
+          <w:sz w:val="28"/>
+          <w:szCs w:val="28"/>
+        </w:rPr>
+        <w:t>FROM mcr.microsoft.com/playwright:v1.56.1-noble</w:t>
+      </w:r>
+    </w:p>
+    <w:p>
+      <w:pPr>
+        <w:rPr>
+          <w:i/>
+          <w:iCs/>
+        </w:rPr>
+      </w:pPr>
+      <w:r>
+        <w:rPr>
+          <w:i/>
+          <w:iCs/>
+        </w:rPr>
+        <w:t>(</w:t>
+      </w:r>
+      <w:r>
+        <w:rPr>
+          <w:rFonts w:ascii="AppleSystemUIFont" w:hAnsi="AppleSystemUIFont" w:cs="AppleSystemUIFont"/>
+          <w:i/>
+          <w:iCs/>
+          <w:kern w:val="0"/>
+          <w:sz w:val="26"/>
+          <w:szCs w:val="26"/>
+        </w:rPr>
+        <w:t>Starts from Microsoft’s Playwright image, version 1.56.1. It includes a compatible Linux environment and Playwright browsers.</w:t>
+      </w:r>
+      <w:r>
+        <w:rPr>
+          <w:i/>
+          <w:iCs/>
+        </w:rPr>
+        <w:t>)</w:t>
+      </w:r>
+    </w:p>
+    <w:p/>
+    <w:p/>
+    <w:p>
+      <w:pPr>
+        <w:rPr>
+          <w:b/>
+          <w:bCs/>
+          <w:sz w:val="28"/>
+          <w:szCs w:val="28"/>
+        </w:rPr>
+      </w:pPr>
+      <w:r>
+        <w:rPr>
+          <w:b/>
+          <w:bCs/>
+          <w:sz w:val="28"/>
+          <w:szCs w:val="28"/>
+        </w:rPr>
+        <w:t>WORKDIR /app</w:t>
+      </w:r>
+    </w:p>
+    <w:p>
+      <w:pPr>
+        <w:autoSpaceDE w:val="0"/>
+        <w:autoSpaceDN w:val="0"/>
+        <w:adjustRightInd w:val="0"/>
+        <w:spacing w:after="0" w:line="240" w:lineRule="auto"/>
+        <w:rPr>
+          <w:rFonts w:ascii="AppleSystemUIFont" w:hAnsi="AppleSystemUIFont" w:cs="AppleSystemUIFont"/>
+          <w:i/>
+          <w:iCs/>
+          <w:kern w:val="0"/>
+          <w:sz w:val="26"/>
+          <w:szCs w:val="26"/>
+        </w:rPr>
+      </w:pPr>
+      <w:r>
+        <w:rPr>
+          <w:i/>
+          <w:iCs/>
+        </w:rPr>
+        <w:t>(</w:t>
+      </w:r>
+      <w:r>
+        <w:rPr>
+          <w:rFonts w:ascii="AppleSystemUIFont" w:hAnsi="AppleSystemUIFont" w:cs="AppleSystemUIFont"/>
+          <w:i/>
+          <w:iCs/>
+          <w:kern w:val="0"/>
+          <w:sz w:val="26"/>
+          <w:szCs w:val="26"/>
+        </w:rPr>
+        <w:t>Sets /app as the working folder inside the image. Later commands run from there.</w:t>
+      </w:r>
+      <w:r>
+        <w:rPr>
+          <w:i/>
+          <w:iCs/>
+        </w:rPr>
+        <w:t>)</w:t>
+      </w:r>
+    </w:p>
+    <w:p/>
+    <w:p>
+      <w:pPr>
+        <w:rPr>
+          <w:b/>
+          <w:bCs/>
+          <w:sz w:val="28"/>
+          <w:szCs w:val="28"/>
+        </w:rPr>
+      </w:pPr>
+      <w:r>
+        <w:rPr>
+          <w:b/>
+          <w:bCs/>
+          <w:sz w:val="28"/>
+          <w:szCs w:val="28"/>
+        </w:rPr>
+        <w:t>COPY package.json package-lock.json ./</w:t>
+      </w:r>
+    </w:p>
+    <w:p>
+      <w:pPr>
+        <w:rPr>
+          <w:rFonts w:ascii="AppleSystemUIFont" w:hAnsi="AppleSystemUIFont" w:cs="AppleSystemUIFont"/>
+          <w:i/>
+          <w:iCs/>
+          <w:kern w:val="0"/>
+          <w:sz w:val="26"/>
+          <w:szCs w:val="26"/>
+        </w:rPr>
+      </w:pPr>
+      <w:r>
+        <w:rPr>
+          <w:b/>
+          <w:bCs/>
+          <w:i/>
+          <w:iCs/>
+          <w:sz w:val="28"/>
+          <w:szCs w:val="28"/>
+        </w:rPr>
+        <w:t>(</w:t>
+      </w:r>
+      <w:r>
+        <w:rPr>
+          <w:rFonts w:ascii="AppleSystemUIFont" w:hAnsi="AppleSystemUIFont" w:cs="AppleSystemUIFont"/>
+          <w:i/>
+          <w:iCs/>
+          <w:kern w:val="0"/>
+          <w:sz w:val="26"/>
+          <w:szCs w:val="26"/>
+        </w:rPr>
+        <w:t>Copies the the current working folder inside the image.)</w:t>
+      </w:r>
+    </w:p>
+    <w:p>
+      <w:pPr>
+        <w:rPr>
+          <w:b/>
+          <w:bCs/>
+          <w:i/>
+          <w:iCs/>
+          <w:sz w:val="28"/>
+          <w:szCs w:val="28"/>
+        </w:rPr>
+      </w:pPr>
+    </w:p>
+    <w:p>
+      <w:pPr>
+        <w:rPr>
+          <w:b/>
+          <w:bCs/>
+          <w:sz w:val="28"/>
+          <w:szCs w:val="28"/>
+        </w:rPr>
+      </w:pPr>
+      <w:r>
+        <w:rPr>
+          <w:b/>
+          <w:bCs/>
+          <w:sz w:val="28"/>
+          <w:szCs w:val="28"/>
+        </w:rPr>
+        <w:t>RUN npm ci --include=dev</w:t>
+      </w:r>
+    </w:p>
+    <w:p>
+      <w:pPr>
+        <w:autoSpaceDE w:val="0"/>
+        <w:autoSpaceDN w:val="0"/>
+        <w:adjustRightInd w:val="0"/>
+        <w:spacing w:after="0" w:line="240" w:lineRule="auto"/>
+        <w:rPr>
+          <w:i/>
+          <w:iCs/>
+        </w:rPr>
+      </w:pPr>
+      <w:r>
+        <w:rPr>
+          <w:i/>
+          <w:iCs/>
+        </w:rPr>
+        <w:t>(</w:t>
+      </w:r>
+      <w:r>
+        <w:rPr>
+          <w:rFonts w:ascii="AppleSystemUIFont" w:hAnsi="AppleSystemUIFont" w:cs="AppleSystemUIFont"/>
+          <w:i/>
+          <w:iCs/>
+          <w:kern w:val="0"/>
+          <w:sz w:val="26"/>
+          <w:szCs w:val="26"/>
+        </w:rPr>
+        <w:t>nstalls the exact dependencies recorded in package-lock.json, including development dependencies such as Playwright Test.</w:t>
+      </w:r>
+      <w:r>
+        <w:rPr>
+          <w:i/>
+          <w:iCs/>
+        </w:rPr>
+        <w:t>)</w:t>
+      </w:r>
+    </w:p>
+    <w:p>
+      <w:pPr>
+        <w:autoSpaceDE w:val="0"/>
+        <w:autoSpaceDN w:val="0"/>
+        <w:adjustRightInd w:val="0"/>
+        <w:spacing w:after="0" w:line="240" w:lineRule="auto"/>
+        <w:rPr>
+          <w:i/>
+          <w:iCs/>
+        </w:rPr>
+      </w:pPr>
+    </w:p>
+    <w:p>
+      <w:pPr>
+        <w:autoSpaceDE w:val="0"/>
+        <w:autoSpaceDN w:val="0"/>
+        <w:adjustRightInd w:val="0"/>
+        <w:spacing w:after="0" w:line="240" w:lineRule="auto"/>
+        <w:rPr>
+          <w:rFonts w:ascii="AppleSystemUIFont" w:hAnsi="AppleSystemUIFont" w:cs="AppleSystemUIFont"/>
+          <w:kern w:val="0"/>
+          <w:sz w:val="26"/>
+          <w:szCs w:val="26"/>
+        </w:rPr>
+      </w:pPr>
+    </w:p>
+    <w:p>
+      <w:pPr>
+        <w:rPr>
+          <w:b/>
+          <w:bCs/>
+          <w:sz w:val="28"/>
+          <w:szCs w:val="28"/>
+        </w:rPr>
+      </w:pPr>
+      <w:r>
+        <w:rPr>
+          <w:b/>
+          <w:bCs/>
+          <w:sz w:val="28"/>
+          <w:szCs w:val="28"/>
+        </w:rPr>
+        <w:t>COPY . .</w:t>
+      </w:r>
+    </w:p>
+    <w:p>
+      <w:pPr>
+        <w:autoSpaceDE w:val="0"/>
+        <w:autoSpaceDN w:val="0"/>
+        <w:adjustRightInd w:val="0"/>
+        <w:spacing w:after="0" w:line="240" w:lineRule="auto"/>
+      </w:pPr>
+      <w:r>
+        <w:rPr>
+          <w:i/>
+          <w:iCs/>
+        </w:rPr>
+        <w:t>(</w:t>
+      </w:r>
+      <w:r>
+        <w:rPr>
+          <w:rFonts w:ascii="AppleSystemUIFont" w:hAnsi="AppleSystemUIFont" w:cs="AppleSystemUIFont"/>
+          <w:i/>
+          <w:iCs/>
+          <w:kern w:val="0"/>
+          <w:sz w:val="26"/>
+          <w:szCs w:val="26"/>
+        </w:rPr>
+        <w:t>Copies the rest of the project files from your computer into /app. A .dockerignore file should exclude .env, node_modules, and test output.</w:t>
+      </w:r>
+      <w:r>
+        <w:t>)</w:t>
+      </w:r>
+    </w:p>
+    <w:p>
+      <w:pPr>
+        <w:autoSpaceDE w:val="0"/>
+        <w:autoSpaceDN w:val="0"/>
+        <w:adjustRightInd w:val="0"/>
+        <w:spacing w:after="0" w:line="240" w:lineRule="auto"/>
+      </w:pPr>
+    </w:p>
+    <w:p>
+      <w:pPr>
+        <w:autoSpaceDE w:val="0"/>
+        <w:autoSpaceDN w:val="0"/>
+        <w:adjustRightInd w:val="0"/>
+        <w:spacing w:after="0" w:line="240" w:lineRule="auto"/>
+        <w:rPr>
+          <w:rFonts w:ascii="AppleSystemUIFont" w:hAnsi="AppleSystemUIFont" w:cs="AppleSystemUIFont"/>
+          <w:i/>
+          <w:iCs/>
+          <w:kern w:val="0"/>
+          <w:sz w:val="26"/>
+          <w:szCs w:val="26"/>
+        </w:rPr>
+      </w:pPr>
+    </w:p>
+    <w:p>
+      <w:pPr>
+        <w:rPr>
+          <w:b/>
+          <w:bCs/>
+          <w:sz w:val="28"/>
+          <w:szCs w:val="28"/>
+        </w:rPr>
+      </w:pPr>
+      <w:r>
+        <w:rPr>
+          <w:b/>
+          <w:bCs/>
+          <w:sz w:val="28"/>
+          <w:szCs w:val="28"/>
+        </w:rPr>
+        <w:t>CMD ["npx", "playwright", "test", "tests/featureTests/login.spec.ts"]</w:t>
+      </w:r>
+    </w:p>
+    <w:p>
+      <w:pPr>
+        <w:rPr>
+          <w:rFonts w:ascii="AppleSystemUIFont" w:hAnsi="AppleSystemUIFont" w:cs="AppleSystemUIFont"/>
+          <w:i/>
+          <w:iCs/>
+          <w:kern w:val="0"/>
+          <w:sz w:val="26"/>
+          <w:szCs w:val="26"/>
+        </w:rPr>
+      </w:pPr>
+      <w:r>
+        <w:rPr>
+          <w:i/>
+          <w:iCs/>
+        </w:rPr>
+        <w:t>(</w:t>
+      </w:r>
+      <w:r>
+        <w:rPr>
+          <w:rFonts w:ascii="AppleSystemUIFont" w:hAnsi="AppleSystemUIFont" w:cs="AppleSystemUIFont"/>
+          <w:i/>
+          <w:iCs/>
+          <w:kern w:val="0"/>
+          <w:sz w:val="26"/>
+          <w:szCs w:val="26"/>
+        </w:rPr>
+        <w:t>Sets the default command when the container starts: run the login spec with Playwright. This uses Docker’s exec form, where each array item is a separate command argument.</w:t>
+      </w:r>
+      <w:r>
+        <w:rPr>
+          <w:rFonts w:ascii="AppleSystemUIFont" w:hAnsi="AppleSystemUIFont" w:cs="AppleSystemUIFont"/>
+          <w:i/>
+          <w:iCs/>
+          <w:kern w:val="0"/>
+          <w:sz w:val="26"/>
+          <w:szCs w:val="26"/>
+        </w:rPr>
+        <w:t>)</w:t>
+      </w:r>
+    </w:p>
+    <w:p>
+      <w:pPr>
+        <w:rPr>
+          <w:rFonts w:ascii="AppleSystemUIFont" w:hAnsi="AppleSystemUIFont" w:cs="AppleSystemUIFont"/>
+          <w:i/>
+          <w:iCs/>
+          <w:kern w:val="0"/>
+          <w:sz w:val="26"/>
+          <w:szCs w:val="26"/>
+        </w:rPr>
+      </w:pPr>
+    </w:p>
+    <w:p>
+      <w:pPr>
+        <w:rPr>
+          <w:rFonts w:ascii="AppleSystemUIFont" w:hAnsi="AppleSystemUIFont" w:cs="AppleSystemUIFont"/>
+          <w:i/>
+          <w:iCs/>
+          <w:kern w:val="0"/>
+          <w:sz w:val="26"/>
+          <w:szCs w:val="26"/>
+        </w:rPr>
+      </w:pPr>
+    </w:p>
+    <w:p>
+      <w:pPr>
+        <w:rPr>
+          <w:rFonts w:ascii="AppleSystemUIFont" w:hAnsi="AppleSystemUIFont" w:cs="AppleSystemUIFont"/>
+          <w:kern w:val="0"/>
+          <w:sz w:val="26"/>
+          <w:szCs w:val="26"/>
+        </w:rPr>
+      </w:pPr>
+    </w:p>
+    <w:p>
+      <w:pPr>
+        <w:rPr>
+          <w:rFonts w:ascii="AppleSystemUIFont" w:hAnsi="AppleSystemUIFont" w:cs="AppleSystemUIFont"/>
+          <w:kern w:val="0"/>
+          <w:sz w:val="26"/>
+          <w:szCs w:val="26"/>
+        </w:rPr>
+      </w:pPr>
+    </w:p>
+    <w:p>
+      <w:pPr>
+        <w:rPr>
+          <w:rFonts w:ascii="AppleSystemUIFont" w:hAnsi="AppleSystemUIFont" w:cs="AppleSystemUIFont"/>
+          <w:kern w:val="0"/>
+          <w:sz w:val="26"/>
+          <w:szCs w:val="26"/>
+        </w:rPr>
+      </w:pPr>
+    </w:p>
+    <w:p>
+      <w:pPr>
+        <w:rPr>
+          <w:rFonts w:ascii="AppleSystemUIFont" w:hAnsi="AppleSystemUIFont" w:cs="AppleSystemUIFont"/>
+          <w:kern w:val="0"/>
+          <w:sz w:val="26"/>
+          <w:szCs w:val="26"/>
+        </w:rPr>
+      </w:pPr>
+    </w:p>
+    <w:p>
+      <w:pPr>
+        <w:rPr>
+          <w:rFonts w:ascii="AppleSystemUIFont" w:hAnsi="AppleSystemUIFont" w:cs="AppleSystemUIFont"/>
+          <w:kern w:val="0"/>
+          <w:sz w:val="26"/>
+          <w:szCs w:val="26"/>
+        </w:rPr>
+      </w:pPr>
+      <w:r>
+        <w:rPr>
+          <w:rFonts w:ascii="AppleSystemUIFont" w:hAnsi="AppleSystemUIFont" w:cs="AppleSystemUIFont"/>
+          <w:kern w:val="0"/>
+          <w:sz w:val="26"/>
+          <w:szCs w:val="26"/>
+        </w:rPr>
+        <w:t xml:space="preserve">Before I would build the test container and run it, I would add a .dockerignore file so local dependencies, test </w:t>
+      </w:r>
+      <w:r>
+        <w:rPr>
+          <w:rFonts w:ascii="AppleSystemUIFont" w:hAnsi="AppleSystemUIFont" w:cs="AppleSystemUIFont"/>
+          <w:kern w:val="0"/>
+          <w:sz w:val="26"/>
+          <w:szCs w:val="26"/>
+        </w:rPr>
+        <w:t>output,</w:t>
+      </w:r>
+      <w:r>
+        <w:rPr>
+          <w:rFonts w:ascii="AppleSystemUIFont" w:hAnsi="AppleSystemUIFont" w:cs="AppleSystemUIFont"/>
+          <w:kern w:val="0"/>
+          <w:sz w:val="26"/>
+          <w:szCs w:val="26"/>
+        </w:rPr>
+        <w:t xml:space="preserve"> and credentials aren’t copied into the image. </w:t>
+      </w:r>
+    </w:p>
+    <w:p>
+      <w:pPr>
+        <w:rPr>
+          <w:rFonts w:ascii="AppleSystemUIFont" w:hAnsi="AppleSystemUIFont" w:cs="AppleSystemUIFont"/>
+          <w:b/>
+          <w:bCs/>
+          <w:kern w:val="0"/>
+          <w:sz w:val="26"/>
+          <w:szCs w:val="26"/>
+        </w:rPr>
+      </w:pPr>
+      <w:r>
+        <w:rPr>
+          <w:rFonts w:ascii="AppleSystemUIFont" w:hAnsi="AppleSystemUIFont" w:cs="AppleSystemUIFont"/>
+          <w:b/>
+          <w:bCs/>
+          <w:kern w:val="0"/>
+          <w:sz w:val="26"/>
+          <w:szCs w:val="26"/>
+        </w:rPr>
+        <w:lastRenderedPageBreak/>
+        <w:t>Content of  .dockerignore</w:t>
+      </w:r>
+      <w:r>
+        <w:rPr>
+          <w:rFonts w:ascii="AppleSystemUIFont" w:hAnsi="AppleSystemUIFont" w:cs="AppleSystemUIFont"/>
+          <w:b/>
+          <w:bCs/>
+          <w:kern w:val="0"/>
+          <w:sz w:val="26"/>
+          <w:szCs w:val="26"/>
+        </w:rPr>
+        <w:t xml:space="preserve"> file</w:t>
+      </w:r>
+      <w:r>
+        <w:rPr>
+          <w:rFonts w:ascii="AppleSystemUIFont" w:hAnsi="AppleSystemUIFont" w:cs="AppleSystemUIFont"/>
+          <w:b/>
+          <w:bCs/>
+          <w:kern w:val="0"/>
+          <w:sz w:val="26"/>
+          <w:szCs w:val="26"/>
+        </w:rPr>
+        <w:t>:</w:t>
+      </w:r>
+    </w:p>
+    <w:p>
+      <w:r>
+        <w:t>node_modules</w:t>
+      </w:r>
+    </w:p>
+    <w:p>
+      <w:r>
+        <w:t>.env</w:t>
+      </w:r>
+    </w:p>
+    <w:p>
+      <w:r>
+        <w:t>test-results</w:t>
+      </w:r>
+    </w:p>
+    <w:p>
+      <w:r>
+        <w:t>playwright-report</w:t>
+      </w:r>
+    </w:p>
+    <w:p>
+      <w:r>
+        <w:t>.git</w:t>
+      </w:r>
+    </w:p>
+    <w:p/>
+    <w:p/>
+    <w:p>
+      <w:pPr>
+        <w:rPr>
+          <w:b/>
+          <w:bCs/>
+        </w:rPr>
+      </w:pPr>
+      <w:r>
+        <w:rPr>
+          <w:b/>
+          <w:bCs/>
+        </w:rPr>
+        <w:t>Then</w:t>
+      </w:r>
+      <w:r>
+        <w:rPr>
+          <w:b/>
+          <w:bCs/>
+        </w:rPr>
+        <w:t xml:space="preserve"> I would build and run the test container:</w:t>
+      </w:r>
+    </w:p>
+    <w:p>
+      <w:pPr>
+        <w:rPr>
+          <w:sz w:val="28"/>
+          <w:szCs w:val="28"/>
+        </w:rPr>
+      </w:pPr>
+      <w:r>
+        <w:rPr>
+          <w:sz w:val="28"/>
+          <w:szCs w:val="28"/>
+        </w:rPr>
+        <w:t>docker build -t aldi-playwright-</w:t>
+      </w:r>
+      <w:r>
+        <w:rPr>
+          <w:sz w:val="28"/>
+          <w:szCs w:val="28"/>
+        </w:rPr>
+        <w:t>tests.</w:t>
+      </w:r>
+    </w:p>
+    <w:p>
+      <w:pPr>
+        <w:rPr>
+          <w:sz w:val="28"/>
+          <w:szCs w:val="28"/>
+        </w:rPr>
+      </w:pPr>
+      <w:r>
+        <w:rPr>
+          <w:sz w:val="28"/>
+          <w:szCs w:val="28"/>
+        </w:rPr>
+        <w:t>docker run --rm --env-file .env aldi-playwright-tests</w:t>
+      </w:r>
+    </w:p>
+    <w:p>
+      <w:pPr>
+        <w:rPr>
+          <w:sz w:val="28"/>
+          <w:szCs w:val="28"/>
+        </w:rPr>
+      </w:pPr>
+    </w:p>
+    <w:p>
+      <w:pPr>
+        <w:rPr>
+          <w:sz w:val="28"/>
+          <w:szCs w:val="28"/>
+        </w:rPr>
+      </w:pPr>
+      <w:r>
+        <w:rPr>
+          <w:sz w:val="28"/>
+          <w:szCs w:val="28"/>
+        </w:rPr>
+        <w:t>(</w:t>
+      </w:r>
+      <w:r>
+        <w:rPr>
+          <w:sz w:val="28"/>
+          <w:szCs w:val="28"/>
+        </w:rPr>
+        <w:t>Running</w:t>
+      </w:r>
+      <w:r>
+        <w:rPr>
+          <w:sz w:val="28"/>
+          <w:szCs w:val="28"/>
+        </w:rPr>
+        <w:t xml:space="preserve"> it with “–env-file .env </w:t>
+      </w:r>
+      <w:r>
+        <w:rPr>
+          <w:sz w:val="28"/>
+          <w:szCs w:val="28"/>
+        </w:rPr>
+        <w:t>“ docker</w:t>
+      </w:r>
+      <w:r>
+        <w:rPr>
+          <w:sz w:val="28"/>
+          <w:szCs w:val="28"/>
+        </w:rPr>
+        <w:t xml:space="preserve"> reads and passes the values from .env into the container as env variables. It is good for local runs. If it was integrated into a CI pipeline, I would use the CI system’s secret variables.)</w:t>
+      </w:r>
+    </w:p>
+    <w:p/>
+    <w:p/>
+    <w:p/>
+    <w:p/>
+    <w:p>
+      <w:pPr>
+        <w:rPr>
+          <w:b/>
+          <w:bCs/>
+          <w:sz w:val="32"/>
+          <w:szCs w:val="32"/>
+        </w:rPr>
+      </w:pPr>
+      <w:r>
+        <w:rPr>
+          <w:b/>
+          <w:bCs/>
+          <w:sz w:val="32"/>
+          <w:szCs w:val="32"/>
+        </w:rPr>
+        <w:t>Describe how you would use Selenium and JUnit for automating the testing of the "Delete Task"</w:t>
+      </w:r>
+      <w:r>
+        <w:rPr>
+          <w:b/>
+          <w:bCs/>
+          <w:sz w:val="32"/>
+          <w:szCs w:val="32"/>
+        </w:rPr>
+        <w:t xml:space="preserve"> </w:t>
+      </w:r>
+      <w:r>
+        <w:rPr>
+          <w:b/>
+          <w:bCs/>
+          <w:sz w:val="32"/>
+          <w:szCs w:val="32"/>
+        </w:rPr>
+        <w:t>feature in the web application. Include a brief sample of the test code you would write.</w:t>
+      </w:r>
+    </w:p>
+    <w:p>
+      <w:pPr>
+        <w:rPr>
+          <w:b/>
+          <w:bCs/>
+          <w:sz w:val="28"/>
+          <w:szCs w:val="28"/>
+        </w:rPr>
+      </w:pPr>
+    </w:p>
+    <w:p>
+      <w:pPr>
+        <w:rPr>
+          <w:sz w:val="28"/>
+          <w:szCs w:val="28"/>
+        </w:rPr>
+      </w:pPr>
+      <w:r>
+        <w:rPr>
+          <w:sz w:val="28"/>
+          <w:szCs w:val="28"/>
+        </w:rPr>
+        <w:t xml:space="preserve">For **Delete Task**, I’d use Selenium to automate the user-facing workflow and JUnit to organize the test and check its results. I’d create a task first, locate it by a unique title or stable test ID, select its Delete button, confirm the </w:t>
+      </w:r>
+      <w:r>
+        <w:rPr>
+          <w:sz w:val="28"/>
+          <w:szCs w:val="28"/>
+        </w:rPr>
+        <w:lastRenderedPageBreak/>
+        <w:t>deletion if prompted, and verify the task disappears. I’d also refresh the page to confirm it stays deleted. Explicit waits and stable accessible selectors help keep the test reliable.</w:t>
+      </w:r>
+    </w:p>
+    <w:p>
+      <w:pPr>
+        <w:rPr>
+          <w:sz w:val="28"/>
+          <w:szCs w:val="28"/>
+        </w:rPr>
+      </w:pPr>
+      <w:r>
+        <w:rPr>
+          <w:sz w:val="28"/>
+          <w:szCs w:val="28"/>
+        </w:rPr>
+        <w:t>I’d use setup and cleanup methods to keep each test isolated.</w:t>
+      </w:r>
+    </w:p>
+    <w:p>
+      <w:pPr>
+        <w:rPr>
+          <w:sz w:val="28"/>
+          <w:szCs w:val="28"/>
+        </w:rPr>
+      </w:pPr>
+    </w:p>
+    <w:p>
+      <w:pPr>
+        <w:rPr>
+          <w:sz w:val="28"/>
+          <w:szCs w:val="28"/>
+        </w:rPr>
+      </w:pPr>
+      <w:r>
+        <w:rPr>
+          <w:sz w:val="28"/>
+          <w:szCs w:val="28"/>
+        </w:rPr>
+        <w:t>Example Java code in Junit test framework that uses Selenium for browser interactions:</w:t>
+      </w:r>
+    </w:p>
+    <w:p/>
+    <w:p>
+      <w:pPr>
+        <w:rPr>
+          <w:b/>
+          <w:bCs/>
+          <w:sz w:val="32"/>
+          <w:szCs w:val="32"/>
+        </w:rPr>
+      </w:pPr>
+      <w:r>
+        <w:rPr>
+          <w:b/>
+          <w:bCs/>
+          <w:sz w:val="32"/>
+          <w:szCs w:val="32"/>
+        </w:rPr>
+        <w:drawing>
+          <wp:inline distT="0" distB="0" distL="0" distR="0" wp14:anchorId="7A17F0C9" wp14:editId="41022162">
+            <wp:extent cx="5689600" cy="5410200"/>
+            <wp:effectExtent l="0" t="0" r="0" b="0"/>
+            <wp:docPr id="657171592" name="Picture 1"/>
+            <wp:cNvGraphicFramePr>
+              <a:graphicFrameLocks xmlns:a="http://schemas.openxmlformats.org/drawingml/2006/main" noChangeAspect="1"/>
+            </wp:cNvGraphicFramePr>
+            <a:graphic xmlns:a="http://schemas.openxmlformats.org/drawingml/2006/main">
+              <a:graphicData uri="http://schemas.openxmlformats.org/drawingml/2006/picture">
+                <pic:pic xmlns:pic="http://schemas.openxmlformats.org/drawingml/2006/picture">
+                  <pic:nvPicPr>
+                    <pic:cNvPr id="657171592" name=""/>
+                    <pic:cNvPicPr/>
+                  </pic:nvPicPr>
+                  <pic:blipFill>
+                    <a:blip r:embed="rId9"/>
+                    <a:stretch>
+                      <a:fillRect/>
+                    </a:stretch>
+                  </pic:blipFill>
+                  <pic:spPr>
+                    <a:xfrm>
+                      <a:off x="0" y="0"/>
+                      <a:ext cx="5689600" cy="5410200"/>
+                    </a:xfrm>
+                    <a:prstGeom prst="rect">
+                      <a:avLst/>
+                    </a:prstGeom>
+                  </pic:spPr>
+                </pic:pic>
+              </a:graphicData>
+            </a:graphic>
+          </wp:inline>
+        </w:drawing>
+      </w:r>
+    </w:p>
+    <w:p>
+      <w:pPr>
+        <w:rPr>
+          <w:b/>
+          <w:bCs/>
+          <w:sz w:val="32"/>
+          <w:szCs w:val="32"/>
+        </w:rPr>
+      </w:pPr>
+      <w:r>
+        <w:rPr>
+          <w:b/>
+          <w:bCs/>
+          <w:sz w:val="32"/>
+          <w:szCs w:val="32"/>
+        </w:rPr>
+        <w:lastRenderedPageBreak/>
+        <w:drawing>
+          <wp:inline distT="0" distB="0" distL="0" distR="0" wp14:anchorId="215BB68E" wp14:editId="248E76B3">
+            <wp:extent cx="5892800" cy="5219700"/>
+            <wp:effectExtent l="0" t="0" r="0" b="0"/>
+            <wp:docPr id="802569499" name="Picture 1"/>
+            <wp:cNvGraphicFramePr>
+              <a:graphicFrameLocks xmlns:a="http://schemas.openxmlformats.org/drawingml/2006/main" noChangeAspect="1"/>
+            </wp:cNvGraphicFramePr>
+            <a:graphic xmlns:a="http://schemas.openxmlformats.org/drawingml/2006/main">
+              <a:graphicData uri="http://schemas.openxmlformats.org/drawingml/2006/picture">
+                <pic:pic xmlns:pic="http://schemas.openxmlformats.org/drawingml/2006/picture">
+                  <pic:nvPicPr>
+                    <pic:cNvPr id="802569499" name=""/>
+                    <pic:cNvPicPr/>
+                  </pic:nvPicPr>
+                  <pic:blipFill>
+                    <a:blip r:embed="rId10"/>
+                    <a:stretch>
+                      <a:fillRect/>
+                    </a:stretch>
+                  </pic:blipFill>
+                  <pic:spPr>
+                    <a:xfrm>
+                      <a:off x="0" y="0"/>
+                      <a:ext cx="5892800" cy="5219700"/>
+                    </a:xfrm>
+                    <a:prstGeom prst="rect">
+                      <a:avLst/>
+                    </a:prstGeom>
+                  </pic:spPr>
+                </pic:pic>
+              </a:graphicData>
+            </a:graphic>
+          </wp:inline>
+        </w:drawing>
+      </w:r>
+    </w:p>
+    <w:p>
+      <w:pPr>
+        <w:rPr>
+          <w:b/>
+          <w:bCs/>
+          <w:sz w:val="32"/>
+          <w:szCs w:val="32"/>
+        </w:rPr>
+      </w:pPr>
+    </w:p>
+    <w:p>
+      <w:pPr>
+        <w:rPr>
+          <w:b/>
+          <w:bCs/>
+          <w:sz w:val="32"/>
+          <w:szCs w:val="32"/>
+        </w:rPr>
+      </w:pPr>
+    </w:p>
+    <w:p>
+      <w:pPr>
+        <w:rPr>
+          <w:b/>
+          <w:bCs/>
+          <w:sz w:val="32"/>
+          <w:szCs w:val="32"/>
+        </w:rPr>
+      </w:pPr>
+    </w:p>
+    <w:p>
+      <w:pPr>
+        <w:rPr>
+          <w:b/>
+          <w:bCs/>
+          <w:sz w:val="32"/>
+          <w:szCs w:val="32"/>
+        </w:rPr>
+      </w:pPr>
+    </w:p>
+    <w:p>
+      <w:pPr>
+        <w:rPr>
+          <w:b/>
+          <w:bCs/>
+          <w:sz w:val="32"/>
+          <w:szCs w:val="32"/>
+        </w:rPr>
+      </w:pPr>
+    </w:p>
+    <w:p>
+      <w:pPr>
+        <w:rPr>
+          <w:b/>
+          <w:bCs/>
+          <w:sz w:val="32"/>
+          <w:szCs w:val="32"/>
+        </w:rPr>
+      </w:pPr>
+    </w:p>
+    <w:p>
+      <w:pPr>
+        <w:rPr>
+          <w:b/>
+          <w:bCs/>
+          <w:sz w:val="32"/>
+          <w:szCs w:val="32"/>
+        </w:rPr>
+      </w:pPr>
+    </w:p>
+    <w:p>
+      <w:pPr>
+        <w:rPr>
+          <w:b/>
+          <w:bCs/>
+          <w:sz w:val="32"/>
+          <w:szCs w:val="32"/>
+        </w:rPr>
+      </w:pPr>
+      <w:r>
+        <w:rPr>
+          <w:b/>
+          <w:bCs/>
+          <w:sz w:val="32"/>
+          <w:szCs w:val="32"/>
+        </w:rPr>
+        <w:lastRenderedPageBreak/>
+        <w:t>Explain how you would integrate your tests into a Continuous Integration (CI) pipeline. Which</w:t>
+      </w:r>
+      <w:r>
+        <w:rPr>
+          <w:b/>
+          <w:bCs/>
+          <w:sz w:val="32"/>
+          <w:szCs w:val="32"/>
+        </w:rPr>
+        <w:t xml:space="preserve"> </w:t>
+      </w:r>
+      <w:r>
+        <w:rPr>
+          <w:b/>
+          <w:bCs/>
+          <w:sz w:val="32"/>
+          <w:szCs w:val="32"/>
+        </w:rPr>
+        <w:t>tools and processes would you utilize to ensure that tests are automatically run on each code</w:t>
+      </w:r>
+      <w:r>
+        <w:rPr>
+          <w:b/>
+          <w:bCs/>
+          <w:sz w:val="32"/>
+          <w:szCs w:val="32"/>
+        </w:rPr>
+        <w:t xml:space="preserve"> </w:t>
+      </w:r>
+      <w:r>
+        <w:rPr>
+          <w:b/>
+          <w:bCs/>
+          <w:sz w:val="32"/>
+          <w:szCs w:val="32"/>
+        </w:rPr>
+        <w:t>commit or pull request? Provide an example of a CI tool you have used or are familiar with.</w:t>
+      </w:r>
+    </w:p>
+    <w:p>
+      <w:pPr>
+        <w:rPr>
+          <w:b/>
+          <w:bCs/>
+          <w:sz w:val="32"/>
+          <w:szCs w:val="32"/>
+        </w:rPr>
+      </w:pPr>
+    </w:p>
+    <w:p>
+      <w:pPr>
+        <w:autoSpaceDE w:val="0"/>
+        <w:autoSpaceDN w:val="0"/>
+        <w:adjustRightInd w:val="0"/>
+        <w:spacing w:after="0" w:line="240" w:lineRule="auto"/>
+        <w:rPr>
+          <w:rFonts w:ascii="AppleSystemUIFont" w:hAnsi="AppleSystemUIFont" w:cs="AppleSystemUIFont"/>
+          <w:kern w:val="0"/>
+          <w:sz w:val="28"/>
+          <w:szCs w:val="28"/>
+        </w:rPr>
+      </w:pPr>
+      <w:r>
+        <w:rPr>
+          <w:rFonts w:ascii="AppleSystemUIFont" w:hAnsi="AppleSystemUIFont" w:cs="AppleSystemUIFont"/>
+          <w:kern w:val="0"/>
+          <w:sz w:val="28"/>
+          <w:szCs w:val="28"/>
+        </w:rPr>
+        <w:t>I would use </w:t>
+      </w:r>
+      <w:r>
+        <w:rPr>
+          <w:rFonts w:ascii="AppleSystemUIFont" w:hAnsi="AppleSystemUIFont" w:cs="AppleSystemUIFont"/>
+          <w:b/>
+          <w:bCs/>
+          <w:kern w:val="0"/>
+          <w:sz w:val="28"/>
+          <w:szCs w:val="28"/>
+        </w:rPr>
+        <w:t>GitHub Actions</w:t>
+      </w:r>
+      <w:r>
+        <w:rPr>
+          <w:rFonts w:ascii="AppleSystemUIFont" w:hAnsi="AppleSystemUIFont" w:cs="AppleSystemUIFont"/>
+          <w:kern w:val="0"/>
+          <w:sz w:val="28"/>
+          <w:szCs w:val="28"/>
+        </w:rPr>
+        <w:t> because the project is hosted on GitHub. I’d configure a workflow to run when code is pushed and whenever a pull request is opened or updated.</w:t>
+      </w:r>
+    </w:p>
+    <w:p>
+      <w:pPr>
+        <w:autoSpaceDE w:val="0"/>
+        <w:autoSpaceDN w:val="0"/>
+        <w:adjustRightInd w:val="0"/>
+        <w:spacing w:after="0" w:line="240" w:lineRule="auto"/>
+        <w:rPr>
+          <w:rFonts w:ascii="AppleSystemUIFont" w:hAnsi="AppleSystemUIFont" w:cs="AppleSystemUIFont"/>
+          <w:kern w:val="0"/>
+          <w:sz w:val="28"/>
+          <w:szCs w:val="28"/>
+        </w:rPr>
+      </w:pPr>
+      <w:r>
+        <w:rPr>
+          <w:rFonts w:ascii="AppleSystemUIFont" w:hAnsi="AppleSystemUIFont" w:cs="AppleSystemUIFont"/>
+          <w:kern w:val="0"/>
+          <w:sz w:val="28"/>
+          <w:szCs w:val="28"/>
+        </w:rPr>
+        <w:t xml:space="preserve">The workflow would start with a clean Linux runner, install the project’s locked dependencies with npm ci, install the matching Playwright browser, and run TypeScript checks and the browser tests. I’d store authorized test-account credentials in GitHub Secrets, not in the repository. </w:t>
+      </w:r>
+    </w:p>
+    <w:p>
+      <w:pPr>
+        <w:autoSpaceDE w:val="0"/>
+        <w:autoSpaceDN w:val="0"/>
+        <w:adjustRightInd w:val="0"/>
+        <w:spacing w:after="0" w:line="240" w:lineRule="auto"/>
+        <w:rPr>
+          <w:rFonts w:ascii="AppleSystemUIFont" w:hAnsi="AppleSystemUIFont" w:cs="AppleSystemUIFont"/>
+          <w:kern w:val="0"/>
+          <w:sz w:val="28"/>
+          <w:szCs w:val="28"/>
+        </w:rPr>
+      </w:pPr>
+      <w:r>
+        <w:rPr>
+          <w:rFonts w:ascii="AppleSystemUIFont" w:hAnsi="AppleSystemUIFont" w:cs="AppleSystemUIFont"/>
+          <w:kern w:val="0"/>
+          <w:sz w:val="28"/>
+          <w:szCs w:val="28"/>
+        </w:rPr>
+        <w:t xml:space="preserve">After the run, I’d save the Playwright report and failure traces as workflow artifacts so developers can investigate failures. I’d also require the workflow to pass before merging a pull request. </w:t>
+      </w:r>
+    </w:p>
+    <w:p>
+      <w:pPr>
+        <w:rPr>
+          <w:b/>
+          <w:bCs/>
+          <w:sz w:val="32"/>
+          <w:szCs w:val="32"/>
+        </w:rPr>
+      </w:pPr>
+      <w:r>
+        <w:rPr>
+          <w:rFonts w:ascii="AppleSystemUIFont" w:hAnsi="AppleSystemUIFont" w:cs="AppleSystemUIFont"/>
+          <w:kern w:val="0"/>
+          <w:sz w:val="26"/>
+          <w:szCs w:val="26"/>
+        </w:rPr>
+        <w:lastRenderedPageBreak/>
+        <w:t>A simplified GitHub Actions workflow coul</w:t>
+      </w:r>
+      <w:r>
+        <w:rPr>
+          <w:rFonts w:ascii="AppleSystemUIFont" w:hAnsi="AppleSystemUIFont" w:cs="AppleSystemUIFont"/>
+          <w:kern w:val="0"/>
+          <w:sz w:val="26"/>
+          <w:szCs w:val="26"/>
+        </w:rPr>
+        <w:t>d look like this:</w:t>
+      </w:r>
+      <w:r>
+        <w:rPr>
+          <w:b/>
+          <w:bCs/>
+          <w:sz w:val="32"/>
+          <w:szCs w:val="32"/>
+        </w:rPr>
+        <w:drawing>
+          <wp:inline distT="0" distB="0" distL="0" distR="0" wp14:anchorId="662E444B" wp14:editId="17FEE576">
+            <wp:extent cx="5588000" cy="4038600"/>
+            <wp:effectExtent l="0" t="0" r="0" b="0"/>
+            <wp:docPr id="1842915959" name="Picture 1"/>
+            <wp:cNvGraphicFramePr>
+              <a:graphicFrameLocks xmlns:a="http://schemas.openxmlformats.org/drawingml/2006/main" noChangeAspect="1"/>
+            </wp:cNvGraphicFramePr>
+            <a:graphic xmlns:a="http://schemas.openxmlformats.org/drawingml/2006/main">
+              <a:graphicData uri="http://schemas.openxmlformats.org/drawingml/2006/picture">
+                <pic:pic xmlns:pic="http://schemas.openxmlformats.org/drawingml/2006/picture">
+                  <pic:nvPicPr>
+                    <pic:cNvPr id="1842915959" name=""/>
+                    <pic:cNvPicPr/>
+                  </pic:nvPicPr>
+                  <pic:blipFill>
+                    <a:blip r:embed="rId11"/>
+                    <a:stretch>
+                      <a:fillRect/>
+                    </a:stretch>
+                  </pic:blipFill>
+                  <pic:spPr>
+                    <a:xfrm>
+                      <a:off x="0" y="0"/>
+                      <a:ext cx="5588000" cy="4038600"/>
+                    </a:xfrm>
+                    <a:prstGeom prst="rect">
+                      <a:avLst/>
+                    </a:prstGeom>
+                  </pic:spPr>
+                </pic:pic>
+              </a:graphicData>
+            </a:graphic>
+          </wp:inline>
+        </w:drawing>
+      </w:r>
+      <w:r>
+        <w:rPr>
+          <w:rFonts w:ascii="AppleSystemUIFont" w:hAnsi="AppleSystemUIFont" w:cs="AppleSystemUIFont"/>
+          <w:kern w:val="0"/>
+          <w:sz w:val="26"/>
+          <w:szCs w:val="26"/>
+        </w:rPr>
+        <w:t xml:space="preserve">d </w:t>
+      </w:r>
+    </w:p>
+    <w:p>
+      <w:pPr>
+        <w:rPr>
+          <w:b/>
+          <w:bCs/>
+          <w:sz w:val="32"/>
+          <w:szCs w:val="32"/>
+        </w:rPr>
+      </w:pPr>
+      <w:r>
+        <w:rPr>
+          <w:b/>
+          <w:bCs/>
+          <w:sz w:val="32"/>
+          <w:szCs w:val="32"/>
+        </w:rPr>
+        <w:drawing>
+          <wp:inline distT="0" distB="0" distL="0" distR="0" wp14:anchorId="47BE6F4D" wp14:editId="6FC0C831">
+            <wp:extent cx="5588000" cy="2336800"/>
+            <wp:effectExtent l="0" t="0" r="0" b="0"/>
+            <wp:docPr id="859310027" name="Picture 1"/>
+            <wp:cNvGraphicFramePr>
+              <a:graphicFrameLocks xmlns:a="http://schemas.openxmlformats.org/drawingml/2006/main" noChangeAspect="1"/>
+            </wp:cNvGraphicFramePr>
+            <a:graphic xmlns:a="http://schemas.openxmlformats.org/drawingml/2006/main">
+              <a:graphicData uri="http://schemas.openxmlformats.org/drawingml/2006/picture">
+                <pic:pic xmlns:pic="http://schemas.openxmlformats.org/drawingml/2006/picture">
+                  <pic:nvPicPr>
+                    <pic:cNvPr id="859310027" name=""/>
+                    <pic:cNvPicPr/>
+                  </pic:nvPicPr>
+                  <pic:blipFill>
+                    <a:blip r:embed="rId12"/>
+                    <a:stretch>
+                      <a:fillRect/>
+                    </a:stretch>
+                  </pic:blipFill>
+                  <pic:spPr>
+                    <a:xfrm>
+                      <a:off x="0" y="0"/>
+                      <a:ext cx="5588000" cy="2336800"/>
+                    </a:xfrm>
+                    <a:prstGeom prst="rect">
+                      <a:avLst/>
+                    </a:prstGeom>
+                  </pic:spPr>
+                </pic:pic>
+              </a:graphicData>
+            </a:graphic>
+          </wp:inline>
+        </w:drawing>
+      </w:r>
+    </w:p>
+    <w:p>
+      <w:pPr>
+        <w:rPr>
+          <w:b/>
+          <w:bCs/>
+          <w:sz w:val="32"/>
+          <w:szCs w:val="32"/>
+        </w:rPr>
+      </w:pPr>
+    </w:p>
+    <w:p>
+      <w:pPr>
+        <w:rPr>
+          <w:sz w:val="28"/>
+          <w:szCs w:val="28"/>
+        </w:rPr>
+      </w:pPr>
+      <w:r>
+        <w:rPr>
+          <w:sz w:val="28"/>
+          <w:szCs w:val="28"/>
+        </w:rPr>
+        <w:t xml:space="preserve">This </w:t>
+      </w:r>
+      <w:r>
+        <w:rPr>
+          <w:rFonts w:ascii="AppleSystemUIFont" w:hAnsi="AppleSystemUIFont" w:cs="AppleSystemUIFont"/>
+          <w:kern w:val="0"/>
+          <w:sz w:val="28"/>
+          <w:szCs w:val="28"/>
+        </w:rPr>
+        <w:t>YAML</w:t>
+      </w:r>
+      <w:r>
+        <w:rPr>
+          <w:rFonts w:ascii="AppleSystemUIFont" w:hAnsi="AppleSystemUIFont" w:cs="AppleSystemUIFont"/>
+          <w:kern w:val="0"/>
+          <w:sz w:val="28"/>
+          <w:szCs w:val="28"/>
+        </w:rPr>
+        <w:t xml:space="preserve"> </w:t>
+      </w:r>
+      <w:r>
+        <w:rPr>
+          <w:sz w:val="28"/>
+          <w:szCs w:val="28"/>
+        </w:rPr>
+        <w:t>file</w:t>
+      </w:r>
+      <w:r>
+        <w:rPr>
+          <w:sz w:val="28"/>
+          <w:szCs w:val="28"/>
+        </w:rPr>
+        <w:t xml:space="preserve"> with the code,</w:t>
+      </w:r>
+      <w:r>
+        <w:rPr>
+          <w:sz w:val="28"/>
+          <w:szCs w:val="28"/>
+        </w:rPr>
+        <w:t xml:space="preserve"> would need to be placed into the repository root into these folders: </w:t>
+      </w:r>
+      <w:r>
+        <w:rPr>
+          <w:sz w:val="28"/>
+          <w:szCs w:val="28"/>
+        </w:rPr>
+        <w:t>.github/workflows/playwright.yml</w:t>
+      </w:r>
+      <w:r>
+        <w:rPr>
+          <w:sz w:val="28"/>
+          <w:szCs w:val="28"/>
+        </w:rPr>
+        <w:t xml:space="preserve">  - so Github Actions would detect it and run the workflow on pushes and pull requests.</w:t>
+      </w:r>
+    </w:p>
+    <w:p>
+      <w:pPr>
+        <w:autoSpaceDE w:val="0"/>
+        <w:autoSpaceDN w:val="0"/>
+        <w:adjustRightInd w:val="0"/>
+        <w:spacing w:after="0" w:line="240" w:lineRule="auto"/>
+        <w:rPr>
+          <w:rFonts w:ascii="AppleSystemUIFont" w:hAnsi="AppleSystemUIFont" w:cs="AppleSystemUIFont"/>
+          <w:kern w:val="0"/>
+          <w:sz w:val="28"/>
+          <w:szCs w:val="28"/>
+        </w:rPr>
+      </w:pPr>
+      <w:r>
+        <w:rPr>
+          <w:rFonts w:ascii="AppleSystemUIFont" w:hAnsi="AppleSystemUIFont" w:cs="AppleSystemUIFont"/>
+          <w:kern w:val="0"/>
+          <w:sz w:val="28"/>
+          <w:szCs w:val="28"/>
+        </w:rPr>
+        <w:lastRenderedPageBreak/>
+        <w:t>That requirement</w:t>
+      </w:r>
+      <w:r>
+        <w:rPr>
+          <w:rFonts w:ascii="AppleSystemUIFont" w:hAnsi="AppleSystemUIFont" w:cs="AppleSystemUIFont"/>
+          <w:kern w:val="0"/>
+          <w:sz w:val="28"/>
+          <w:szCs w:val="28"/>
+        </w:rPr>
+        <w:t xml:space="preserve"> for the workflow to pass before merge,</w:t>
+      </w:r>
+      <w:r>
+        <w:rPr>
+          <w:rFonts w:ascii="AppleSystemUIFont" w:hAnsi="AppleSystemUIFont" w:cs="AppleSystemUIFont"/>
+          <w:kern w:val="0"/>
+          <w:sz w:val="28"/>
+          <w:szCs w:val="28"/>
+        </w:rPr>
+        <w:t xml:space="preserve"> isn’t in the YAML. GitHub must be configured separately to block merging until it passes.</w:t>
+      </w:r>
+    </w:p>
+    <w:p>
+      <w:pPr>
+        <w:rPr>
+          <w:rFonts w:ascii="AppleSystemUIFont" w:hAnsi="AppleSystemUIFont" w:cs="AppleSystemUIFont"/>
+          <w:kern w:val="0"/>
+          <w:sz w:val="28"/>
+          <w:szCs w:val="28"/>
+        </w:rPr>
+      </w:pPr>
+      <w:r>
+        <w:rPr>
+          <w:rFonts w:ascii="AppleSystemUIFont" w:hAnsi="AppleSystemUIFont" w:cs="AppleSystemUIFont"/>
+          <w:kern w:val="0"/>
+          <w:sz w:val="28"/>
+          <w:szCs w:val="28"/>
+        </w:rPr>
+        <w:t>In the repository</w:t>
+      </w:r>
+      <w:r>
+        <w:rPr>
+          <w:rFonts w:ascii="AppleSystemUIFont" w:hAnsi="AppleSystemUIFont" w:cs="AppleSystemUIFont"/>
+          <w:kern w:val="0"/>
+          <w:sz w:val="28"/>
+          <w:szCs w:val="28"/>
+        </w:rPr>
+        <w:t xml:space="preserve"> we need to </w:t>
+      </w:r>
+      <w:r>
+        <w:rPr>
+          <w:rFonts w:ascii="AppleSystemUIFont" w:hAnsi="AppleSystemUIFont" w:cs="AppleSystemUIFont"/>
+          <w:kern w:val="0"/>
+          <w:sz w:val="28"/>
+          <w:szCs w:val="28"/>
+        </w:rPr>
+        <w:t xml:space="preserve">create a rule for </w:t>
+      </w:r>
+      <w:r>
+        <w:rPr>
+          <w:rFonts w:ascii="AppleSystemUIFont" w:hAnsi="AppleSystemUIFont" w:cs="AppleSystemUIFont"/>
+          <w:kern w:val="0"/>
+          <w:sz w:val="28"/>
+          <w:szCs w:val="28"/>
+        </w:rPr>
+        <w:t>the</w:t>
+      </w:r>
+      <w:r>
+        <w:rPr>
+          <w:rFonts w:ascii="AppleSystemUIFont" w:hAnsi="AppleSystemUIFont" w:cs="AppleSystemUIFont"/>
+          <w:kern w:val="0"/>
+          <w:sz w:val="28"/>
+          <w:szCs w:val="28"/>
+        </w:rPr>
+        <w:t xml:space="preserve"> target </w:t>
+      </w:r>
+      <w:r>
+        <w:rPr>
+          <w:rFonts w:ascii="AppleSystemUIFont" w:hAnsi="AppleSystemUIFont" w:cs="AppleSystemUIFont"/>
+          <w:kern w:val="0"/>
+          <w:sz w:val="28"/>
+          <w:szCs w:val="28"/>
+        </w:rPr>
+        <w:t>branch and</w:t>
+      </w:r>
+      <w:r>
+        <w:rPr>
+          <w:rFonts w:ascii="AppleSystemUIFont" w:hAnsi="AppleSystemUIFont" w:cs="AppleSystemUIFont"/>
+          <w:kern w:val="0"/>
+          <w:sz w:val="28"/>
+          <w:szCs w:val="28"/>
+        </w:rPr>
+        <w:t xml:space="preserve"> enable </w:t>
+      </w:r>
+      <w:r>
+        <w:rPr>
+          <w:rFonts w:ascii="AppleSystemUIFont" w:hAnsi="AppleSystemUIFont" w:cs="AppleSystemUIFont"/>
+          <w:b/>
+          <w:bCs/>
+          <w:kern w:val="0"/>
+          <w:sz w:val="28"/>
+          <w:szCs w:val="28"/>
+        </w:rPr>
+        <w:t>Require status checks to pass before merging</w:t>
+      </w:r>
+      <w:r>
+        <w:rPr>
+          <w:rFonts w:ascii="AppleSystemUIFont" w:hAnsi="AppleSystemUIFont" w:cs="AppleSystemUIFont"/>
+          <w:kern w:val="0"/>
+          <w:sz w:val="28"/>
+          <w:szCs w:val="28"/>
+        </w:rPr>
+        <w:t xml:space="preserve"> -</w:t>
+      </w:r>
+      <w:r>
+        <w:rPr>
+          <w:rFonts w:ascii="AppleSystemUIFont" w:hAnsi="AppleSystemUIFont" w:cs="AppleSystemUIFont"/>
+          <w:kern w:val="0"/>
+          <w:sz w:val="28"/>
+          <w:szCs w:val="28"/>
+        </w:rPr>
+        <w:t xml:space="preserve"> </w:t>
+      </w:r>
+      <w:r>
+        <w:rPr>
+          <w:rFonts w:ascii="AppleSystemUIFont" w:hAnsi="AppleSystemUIFont" w:cs="AppleSystemUIFont"/>
+          <w:kern w:val="0"/>
+          <w:sz w:val="28"/>
+          <w:szCs w:val="28"/>
+        </w:rPr>
+        <w:t>w</w:t>
+      </w:r>
+      <w:r>
+        <w:rPr>
+          <w:rFonts w:ascii="AppleSystemUIFont" w:hAnsi="AppleSystemUIFont" w:cs="AppleSystemUIFont"/>
+          <w:kern w:val="0"/>
+          <w:sz w:val="28"/>
+          <w:szCs w:val="28"/>
+        </w:rPr>
+        <w:t>e need to s</w:t>
+      </w:r>
+      <w:r>
+        <w:rPr>
+          <w:rFonts w:ascii="AppleSystemUIFont" w:hAnsi="AppleSystemUIFont" w:cs="AppleSystemUIFont"/>
+          <w:kern w:val="0"/>
+          <w:sz w:val="28"/>
+          <w:szCs w:val="28"/>
+        </w:rPr>
+        <w:t xml:space="preserve">elect the Playwright job’s check, such as login-tests. </w:t>
+      </w:r>
+    </w:p>
+    <w:p>
+      <w:pPr>
+        <w:rPr>
+          <w:rFonts w:ascii="AppleSystemUIFont" w:hAnsi="AppleSystemUIFont" w:cs="AppleSystemUIFont"/>
+          <w:kern w:val="0"/>
+          <w:sz w:val="28"/>
+          <w:szCs w:val="28"/>
+        </w:rPr>
+      </w:pPr>
+    </w:p>
+    <w:p>
+      <w:pPr>
+        <w:rPr>
+          <w:sz w:val="28"/>
+          <w:szCs w:val="28"/>
+        </w:rPr>
+      </w:pPr>
+    </w:p>
     <w:sectPr>
       <w:pgSz w:w="12240" w:h="15840"/>
       <w:pgMar w:top="1440" w:right="1440" w:bottom="1440" w:left="1440" w:header="720" w:footer="720" w:gutter="0"/>
@@ -3420,6 +5103,7 @@
   <w:style w:type="paragraph" w:default="1" w:styleId="Normal">
     <w:name w:val="Normal"/>
     <w:qFormat/>
+    <w:rsid w:val="009C0478"/>
   </w:style>
   <w:style w:type="paragraph" w:styleId="Heading1">
     <w:name w:val="heading 1"/>
@@ -3960,6 +5644,45 @@
       <w:shd w:val="clear" w:color="auto" w:fill="E1DFDD"/>
     </w:rPr>
   </w:style>
+  <w:style w:type="character" w:styleId="Strong">
+    <w:name w:val="Strong"/>
+    <w:basedOn w:val="DefaultParagraphFont"/>
+    <w:uiPriority w:val="22"/>
+    <w:qFormat/>
+    <w:rsid w:val="00B507F1"/>
+    <w:rPr>
+      <w:b/>
+      <w:bCs/>
+    </w:rPr>
+  </w:style>
+  <w:style w:type="character" w:styleId="HTMLCode">
+    <w:name w:val="HTML Code"/>
+    <w:basedOn w:val="DefaultParagraphFont"/>
+    <w:uiPriority w:val="99"/>
+    <w:semiHidden/>
+    <w:unhideWhenUsed/>
+    <w:rsid w:val="002234D8"/>
+    <w:rPr>
+      <w:rFonts w:ascii="Courier New" w:eastAsia="Times New Roman" w:hAnsi="Courier New" w:cs="Courier New"/>
+      <w:sz w:val="20"/>
+      <w:szCs w:val="20"/>
+    </w:rPr>
+  </w:style>
+  <w:style w:type="paragraph" w:styleId="NormalWeb">
+    <w:name w:val="Normal (Web)"/>
+    <w:basedOn w:val="Normal"/>
+    <w:uiPriority w:val="99"/>
+    <w:unhideWhenUsed/>
+    <w:rsid w:val="005F66FE"/>
+    <w:pPr>
+      <w:spacing w:before="100" w:beforeAutospacing="1" w:after="100" w:afterAutospacing="1" w:line="240" w:lineRule="auto"/>
+    </w:pPr>
+    <w:rPr>
+      <w:rFonts w:ascii="Times New Roman" w:eastAsia="Times New Roman" w:hAnsi="Times New Roman" w:cs="Times New Roman"/>
+      <w:kern w:val="0"/>
+      <w14:ligatures w14:val="none"/>
+    </w:rPr>
+  </w:style>
 </w:styles>
 </file>
 

</xml_diff>